<commit_message>
WIP: checkpoint current working-tree state before merging Plan 1
Co-Authored-By: Claude <noreply@anthropic.com>
</commit_message>
<xml_diff>
--- a/data/sample-docs/bid.docx
+++ b/data/sample-docs/bid.docx
@@ -85,7 +85,7 @@
       <w:r>
         <w:drawing>
           <wp:inline xmlns:a="http://schemas.openxmlformats.org/drawingml/2006/main" xmlns:pic="http://schemas.openxmlformats.org/drawingml/2006/picture">
-            <wp:extent cx="4572000" cy="1524000"/>
+            <wp:extent cx="4572000" cy="1714500"/>
             <wp:docPr id="1" name="Picture 1"/>
             <wp:cNvGraphicFramePr>
               <a:graphicFrameLocks noChangeAspect="1"/>
@@ -106,7 +106,7 @@
                   <pic:spPr>
                     <a:xfrm>
                       <a:off x="0" y="0"/>
-                      <a:ext cx="4572000" cy="1524000"/>
+                      <a:ext cx="4572000" cy="1714500"/>
                     </a:xfrm>
                     <a:prstGeom prst="rect"/>
                   </pic:spPr>

</xml_diff>